<commit_message>
added updated Task 1, 2 templates, and waiver to /resources
</commit_message>
<xml_diff>
--- a/resources/C964 task 2 template.docx
+++ b/resources/C964 task 2 template.docx
@@ -1422,7 +1422,7 @@
           <w:color w:val="000000" w:themeColor="text1" w:themeTint="FF" w:themeShade="FF"/>
           <w:sz w:val="22"/>
           <w:szCs w:val="22"/>
-          <w:lang w:val="en"/>
+          <w:lang w:val="en-US"/>
         </w:rPr>
       </w:pPr>
       <w:r>
@@ -1438,7 +1438,7 @@
           <w:color w:val="000000" w:themeColor="text1" w:themeTint="FF" w:themeShade="FF"/>
           <w:sz w:val="22"/>
           <w:szCs w:val="22"/>
-          <w:lang w:val="en"/>
+          <w:lang w:val="en-US"/>
         </w:rPr>
         <w:t>How the proposed solution benefits the organization.</w:t>
       </w:r>
@@ -2221,7 +2221,7 @@
           <w:color w:val="000000" w:themeColor="text1" w:themeTint="FF" w:themeShade="FF"/>
           <w:sz w:val="22"/>
           <w:szCs w:val="22"/>
-          <w:lang w:val="en"/>
+          <w:lang w:val="en-US"/>
         </w:rPr>
       </w:pPr>
       <w:r>
@@ -2237,7 +2237,7 @@
           <w:color w:val="000000" w:themeColor="text1" w:themeTint="FF" w:themeShade="FF"/>
           <w:sz w:val="22"/>
           <w:szCs w:val="22"/>
-          <w:lang w:val="en"/>
+          <w:lang w:val="en-US"/>
         </w:rPr>
         <w:t xml:space="preserve">The project proposal should target your client’s middle management. This audience may be IT professionals but have limited computer science expertise. Use appropriate industry jargon and sufficient technical details to describe the proposed project and its application. Remember, you’re establishing the technical context for your project and how it will be implemented for the client. </w:t>
       </w:r>
@@ -2254,7 +2254,7 @@
           <w:color w:val="000000" w:themeColor="text1" w:themeTint="FF" w:themeShade="FF"/>
           <w:sz w:val="22"/>
           <w:szCs w:val="22"/>
-          <w:lang w:val="en"/>
+          <w:lang w:val="en-US"/>
         </w:rPr>
         <w:t xml:space="preserve">Write everything in the future tense.  </w:t>
       </w:r>
@@ -2359,7 +2359,7 @@
           <w:color w:val="000000" w:themeColor="text1" w:themeTint="FF" w:themeShade="FF"/>
           <w:sz w:val="22"/>
           <w:szCs w:val="22"/>
-          <w:lang w:val="en"/>
+          <w:lang w:val="en-US"/>
         </w:rPr>
       </w:pPr>
       <w:r>
@@ -2375,7 +2375,7 @@
           <w:color w:val="000000" w:themeColor="text1" w:themeTint="FF" w:themeShade="FF"/>
           <w:sz w:val="22"/>
           <w:szCs w:val="22"/>
-          <w:lang w:val="en"/>
+          <w:lang w:val="en-US"/>
         </w:rPr>
         <w:t>Summarize the client and their needs as related to the problem.</w:t>
       </w:r>
@@ -2441,7 +2441,7 @@
           <w:color w:val="000000" w:themeColor="text1" w:themeTint="FF" w:themeShade="FF"/>
           <w:sz w:val="22"/>
           <w:szCs w:val="22"/>
-          <w:lang w:val="en"/>
+          <w:lang w:val="en-US"/>
         </w:rPr>
       </w:pPr>
       <w:r>
@@ -2457,7 +2457,7 @@
           <w:color w:val="000000" w:themeColor="text1" w:themeTint="FF" w:themeShade="FF"/>
           <w:sz w:val="22"/>
           <w:szCs w:val="22"/>
-          <w:lang w:val="en"/>
+          <w:lang w:val="en-US"/>
         </w:rPr>
         <w:t xml:space="preserve">Provide a summary justifying how the application will benefit the client. </w:t>
       </w:r>
@@ -2644,7 +2644,7 @@
           <w:color w:val="000000" w:themeColor="text1" w:themeTint="FF" w:themeShade="FF"/>
           <w:sz w:val="22"/>
           <w:szCs w:val="22"/>
-          <w:lang w:val="en"/>
+          <w:lang w:val="en-US"/>
         </w:rPr>
       </w:pPr>
       <w:r>
@@ -2660,7 +2660,7 @@
           <w:color w:val="000000" w:themeColor="text1" w:themeTint="FF" w:themeShade="FF"/>
           <w:sz w:val="22"/>
           <w:szCs w:val="22"/>
-          <w:lang w:val="en"/>
+          <w:lang w:val="en-US"/>
         </w:rPr>
         <w:t xml:space="preserve">Address any ethical or legal concerns regarding the data. If there are no concerns, explain why. </w:t>
       </w:r>
@@ -2848,7 +2848,7 @@
           <w:color w:val="000000" w:themeColor="text1" w:themeTint="FF" w:themeShade="FF"/>
           <w:sz w:val="22"/>
           <w:szCs w:val="22"/>
-          <w:lang w:val="en"/>
+          <w:lang w:val="en-US"/>
         </w:rPr>
       </w:pPr>
       <w:r>
@@ -2864,7 +2864,7 @@
           <w:color w:val="000000" w:themeColor="text1" w:themeTint="FF" w:themeShade="FF"/>
           <w:sz w:val="22"/>
           <w:szCs w:val="22"/>
-          <w:lang w:val="en"/>
+          <w:lang w:val="en-US"/>
         </w:rPr>
         <w:t>Provide a projected timeline, including projected start dates and end dates for each milestone (a table is not required but encouraged).</w:t>
       </w:r>
@@ -3833,7 +3833,7 @@
           <w:color w:val="000000" w:themeColor="text1" w:themeTint="FF" w:themeShade="FF"/>
           <w:sz w:val="22"/>
           <w:szCs w:val="22"/>
-          <w:lang w:val="en"/>
+          <w:lang w:val="en-US"/>
         </w:rPr>
       </w:pPr>
       <w:r>
@@ -3849,7 +3849,7 @@
           <w:color w:val="000000" w:themeColor="text1" w:themeTint="FF" w:themeShade="FF"/>
           <w:sz w:val="22"/>
           <w:szCs w:val="22"/>
-          <w:lang w:val="en"/>
+          <w:lang w:val="en-US"/>
         </w:rPr>
         <w:t xml:space="preserve">The minimal requirments of the submittred </w:t>
       </w:r>
@@ -3866,7 +3866,7 @@
           <w:color w:val="000000" w:themeColor="text1" w:themeTint="FF" w:themeShade="FF"/>
           <w:sz w:val="22"/>
           <w:szCs w:val="22"/>
-          <w:lang w:val="en"/>
+          <w:lang w:val="en-US"/>
         </w:rPr>
         <w:t>application</w:t>
       </w:r>
@@ -3883,7 +3883,7 @@
           <w:color w:val="000000" w:themeColor="text1" w:themeTint="FF" w:themeShade="FF"/>
           <w:sz w:val="22"/>
           <w:szCs w:val="22"/>
-          <w:lang w:val="en"/>
+          <w:lang w:val="en-US"/>
         </w:rPr>
         <w:t xml:space="preserve"> are as follows:</w:t>
       </w:r>
@@ -3908,7 +3908,7 @@
           <w:color w:val="000000" w:themeColor="text1" w:themeTint="FF" w:themeShade="FF"/>
           <w:sz w:val="22"/>
           <w:szCs w:val="22"/>
-          <w:lang w:val="en"/>
+          <w:lang w:val="en-US"/>
         </w:rPr>
       </w:pPr>
       <w:r>
@@ -3924,7 +3924,7 @@
           <w:color w:val="000000" w:themeColor="text1" w:themeTint="FF" w:themeShade="FF"/>
           <w:sz w:val="22"/>
           <w:szCs w:val="22"/>
-          <w:lang w:val="en"/>
+          <w:lang w:val="en-US"/>
         </w:rPr>
         <w:t xml:space="preserve">The applicaton functions as described. </w:t>
       </w:r>
@@ -3941,7 +3941,7 @@
           <w:color w:val="000000" w:themeColor="text1" w:themeTint="FF" w:themeShade="FF"/>
           <w:sz w:val="22"/>
           <w:szCs w:val="22"/>
-          <w:lang w:val="en"/>
+          <w:lang w:val="en-US"/>
         </w:rPr>
         <w:t xml:space="preserve">Following the ‘User Guide’ in part D, the evaluator must be able to succesfully review your application on a Windows 10 machine. </w:t>
       </w:r>
@@ -3966,7 +3966,7 @@
           <w:color w:val="000000" w:themeColor="text1" w:themeTint="FF" w:themeShade="FF"/>
           <w:sz w:val="22"/>
           <w:szCs w:val="22"/>
-          <w:lang w:val="en"/>
+          <w:lang w:val="en-US"/>
         </w:rPr>
       </w:pPr>
       <w:r>
@@ -3982,7 +3982,7 @@
           <w:color w:val="000000" w:themeColor="text1" w:themeTint="FF" w:themeShade="FF"/>
           <w:sz w:val="22"/>
           <w:szCs w:val="22"/>
-          <w:lang w:val="en"/>
+          <w:lang w:val="en-US"/>
         </w:rPr>
         <w:t>A mathematical algorithm applied to data,</w:t>
       </w:r>
@@ -3999,7 +3999,7 @@
           <w:color w:val="000000" w:themeColor="text1" w:themeTint="FF" w:themeShade="FF"/>
           <w:sz w:val="22"/>
           <w:szCs w:val="22"/>
-          <w:lang w:val="en"/>
+          <w:lang w:val="en-US"/>
         </w:rPr>
         <w:t xml:space="preserve"> e.g, supervised, unsupervised, or reinforced machine learning method.</w:t>
       </w:r>
@@ -4024,7 +4024,7 @@
           <w:color w:val="000000" w:themeColor="text1" w:themeTint="FF" w:themeShade="FF"/>
           <w:sz w:val="22"/>
           <w:szCs w:val="22"/>
-          <w:lang w:val="en"/>
+          <w:lang w:val="en-US"/>
         </w:rPr>
       </w:pPr>
       <w:r>
@@ -4040,7 +4040,7 @@
           <w:color w:val="000000" w:themeColor="text1" w:themeTint="FF" w:themeShade="FF"/>
           <w:sz w:val="22"/>
           <w:szCs w:val="22"/>
-          <w:lang w:val="en"/>
+          <w:lang w:val="en-US"/>
         </w:rPr>
         <w:t>A “user interface.”</w:t>
       </w:r>
@@ -4057,7 +4057,7 @@
           <w:color w:val="000000" w:themeColor="text1" w:themeTint="FF" w:themeShade="FF"/>
           <w:sz w:val="22"/>
           <w:szCs w:val="22"/>
-          <w:lang w:val="en"/>
+          <w:lang w:val="en-US"/>
         </w:rPr>
         <w:t xml:space="preserve"> Following the ‘User Guide’ in part D, the client must be able to use the application towards solving the proposed problem (as described in parts A, B, and D). For example, the client can input varaibles and the application oututs a prediction. </w:t>
       </w:r>
@@ -4082,7 +4082,7 @@
           <w:color w:val="000000" w:themeColor="text1" w:themeTint="FF" w:themeShade="FF"/>
           <w:sz w:val="22"/>
           <w:szCs w:val="22"/>
-          <w:lang w:val="en"/>
+          <w:lang w:val="en-US"/>
         </w:rPr>
       </w:pPr>
       <w:r>
@@ -4098,7 +4098,7 @@
           <w:color w:val="000000" w:themeColor="text1" w:themeTint="FF" w:themeShade="FF"/>
           <w:sz w:val="22"/>
           <w:szCs w:val="22"/>
-          <w:lang w:val="en"/>
+          <w:lang w:val="en-US"/>
         </w:rPr>
         <w:t xml:space="preserve">Three visualizations. </w:t>
       </w:r>
@@ -4115,7 +4115,7 @@
           <w:color w:val="000000" w:themeColor="text1" w:themeTint="FF" w:themeShade="FF"/>
           <w:sz w:val="22"/>
           <w:szCs w:val="22"/>
-          <w:lang w:val="en"/>
+          <w:lang w:val="en-US"/>
         </w:rPr>
         <w:t>The visualizations can be included separately when including them in the application is not ideal or possible, e.g., the visualizations describe proprietary data but the application is customer-facing.</w:t>
       </w:r>
@@ -4140,7 +4140,7 @@
           <w:color w:val="000000" w:themeColor="text1" w:themeTint="FF" w:themeShade="FF"/>
           <w:sz w:val="22"/>
           <w:szCs w:val="22"/>
-          <w:lang w:val="en"/>
+          <w:lang w:val="en-US"/>
         </w:rPr>
       </w:pPr>
       <w:r>
@@ -4156,7 +4156,7 @@
           <w:color w:val="000000" w:themeColor="text1" w:themeTint="FF" w:themeShade="FF"/>
           <w:sz w:val="22"/>
           <w:szCs w:val="22"/>
-          <w:lang w:val="en"/>
+          <w:lang w:val="en-US"/>
         </w:rPr>
         <w:t xml:space="preserve">Submitted files and links are static and accessible. </w:t>
       </w:r>
@@ -4173,7 +4173,7 @@
           <w:color w:val="000000" w:themeColor="text1" w:themeTint="FF" w:themeShade="FF"/>
           <w:sz w:val="22"/>
           <w:szCs w:val="22"/>
-          <w:lang w:val="en"/>
+          <w:lang w:val="en-US"/>
         </w:rPr>
         <w:t xml:space="preserve">All data, source code, and links must be accessible to evaluators on a Windows 10 machine. If parts of the project are able to be modified after submission, then matching source files must be submitted. For example, if the application is a website or hosted notebook, the .html or .ipynb files must be submitted directly to assessments. </w:t>
       </w:r>
@@ -4291,7 +4291,7 @@
           <w:color w:val="000000" w:themeColor="text1" w:themeTint="FF" w:themeShade="FF"/>
           <w:sz w:val="22"/>
           <w:szCs w:val="22"/>
-          <w:lang w:val="en"/>
+          <w:lang w:val="en-US"/>
         </w:rPr>
       </w:pPr>
       <w:r>
@@ -4307,7 +4307,7 @@
           <w:color w:val="000000" w:themeColor="text1" w:themeTint="FF" w:themeShade="FF"/>
           <w:sz w:val="22"/>
           <w:szCs w:val="22"/>
-          <w:lang w:val="en"/>
+          <w:lang w:val="en-US"/>
         </w:rPr>
         <w:t xml:space="preserve">Create a post-implementation as outlined below. Provide sufficient detail so that a reader knowledgeable in computer science but unfamiliar with your project can understand what you have accomplished. Using examples and visualizations (including screenshots) beyond the three required is recommended (but not required). </w:t>
       </w:r>
@@ -4324,7 +4324,7 @@
           <w:color w:val="000000" w:themeColor="text1" w:themeTint="FF" w:themeShade="FF"/>
           <w:sz w:val="22"/>
           <w:szCs w:val="22"/>
-          <w:lang w:val="en"/>
+          <w:lang w:val="en-US"/>
         </w:rPr>
         <w:t>Write everything in the past tense.</w:t>
       </w:r>
@@ -4341,7 +4341,7 @@
           <w:color w:val="000000" w:themeColor="text1" w:themeTint="FF" w:themeShade="FF"/>
           <w:sz w:val="22"/>
           <w:szCs w:val="22"/>
-          <w:lang w:val="en"/>
+          <w:lang w:val="en-US"/>
         </w:rPr>
         <w:t xml:space="preserve"> </w:t>
       </w:r>
@@ -4642,7 +4642,7 @@
           <w:color w:val="000000" w:themeColor="text1" w:themeTint="FF" w:themeShade="FF"/>
           <w:sz w:val="22"/>
           <w:szCs w:val="22"/>
-          <w:lang w:val="en"/>
+          <w:lang w:val="en-US"/>
         </w:rPr>
       </w:pPr>
       <w:r>
@@ -4658,7 +4658,7 @@
           <w:color w:val="000000" w:themeColor="text1" w:themeTint="FF" w:themeShade="FF"/>
           <w:sz w:val="22"/>
           <w:szCs w:val="22"/>
-          <w:lang w:val="en"/>
+          <w:lang w:val="en-US"/>
         </w:rPr>
         <w:t>For each employed method (at least one is required) provide the following:</w:t>
       </w:r>
@@ -4683,7 +4683,7 @@
           <w:color w:val="000000" w:themeColor="text1" w:themeTint="FF" w:themeShade="FF"/>
           <w:sz w:val="22"/>
           <w:szCs w:val="22"/>
-          <w:lang w:val="en"/>
+          <w:lang w:val="en-US"/>
         </w:rPr>
       </w:pPr>
       <w:r>
@@ -4699,7 +4699,7 @@
           <w:color w:val="000000" w:themeColor="text1" w:themeTint="FF" w:themeShade="FF"/>
           <w:sz w:val="22"/>
           <w:szCs w:val="22"/>
-          <w:lang w:val="en"/>
+          <w:lang w:val="en-US"/>
         </w:rPr>
         <w:t>Indentify the method and what it does (the “what”).</w:t>
       </w:r>
@@ -4724,7 +4724,7 @@
           <w:color w:val="000000" w:themeColor="text1" w:themeTint="FF" w:themeShade="FF"/>
           <w:sz w:val="22"/>
           <w:szCs w:val="22"/>
-          <w:lang w:val="en"/>
+          <w:lang w:val="en-US"/>
         </w:rPr>
       </w:pPr>
       <w:r>
@@ -4740,7 +4740,7 @@
           <w:color w:val="000000" w:themeColor="text1" w:themeTint="FF" w:themeShade="FF"/>
           <w:sz w:val="22"/>
           <w:szCs w:val="22"/>
-          <w:lang w:val="en"/>
+          <w:lang w:val="en-US"/>
         </w:rPr>
         <w:t xml:space="preserve">Descirbe how the method was developed (the “how”). </w:t>
       </w:r>
@@ -4765,7 +4765,7 @@
           <w:color w:val="000000" w:themeColor="text1" w:themeTint="FF" w:themeShade="FF"/>
           <w:sz w:val="22"/>
           <w:szCs w:val="22"/>
-          <w:lang w:val="en"/>
+          <w:lang w:val="en-US"/>
         </w:rPr>
       </w:pPr>
       <w:r>
@@ -4781,7 +4781,7 @@
           <w:color w:val="000000" w:themeColor="text1" w:themeTint="FF" w:themeShade="FF"/>
           <w:sz w:val="22"/>
           <w:szCs w:val="22"/>
-          <w:lang w:val="en"/>
+          <w:lang w:val="en-US"/>
         </w:rPr>
         <w:t>Justifiy the selection and developement of the method (the “why”).</w:t>
       </w:r>
@@ -4898,7 +4898,7 @@
           <w:color w:val="000000" w:themeColor="text1" w:themeTint="FF" w:themeShade="FF"/>
           <w:sz w:val="22"/>
           <w:szCs w:val="22"/>
-          <w:lang w:val="en"/>
+          <w:lang w:val="en-US"/>
         </w:rPr>
       </w:pPr>
       <w:r>
@@ -4914,7 +4914,7 @@
           <w:color w:val="000000" w:themeColor="text1" w:themeTint="FF" w:themeShade="FF"/>
           <w:sz w:val="22"/>
           <w:szCs w:val="22"/>
-          <w:lang w:val="en"/>
+          <w:lang w:val="en-US"/>
         </w:rPr>
         <w:t xml:space="preserve">An appropiate validaiton method.An appropiate validaiton method. </w:t>
       </w:r>
@@ -4939,7 +4939,7 @@
           <w:color w:val="000000" w:themeColor="text1" w:themeTint="FF" w:themeShade="FF"/>
           <w:sz w:val="22"/>
           <w:szCs w:val="22"/>
-          <w:lang w:val="en"/>
+          <w:lang w:val="en-US"/>
         </w:rPr>
       </w:pPr>
       <w:r>
@@ -4955,7 +4955,7 @@
           <w:color w:val="000000" w:themeColor="text1" w:themeTint="FF" w:themeShade="FF"/>
           <w:sz w:val="22"/>
           <w:szCs w:val="22"/>
-          <w:lang w:val="en"/>
+          <w:lang w:val="en-US"/>
         </w:rPr>
         <w:t xml:space="preserve">Results of the validation method or a future plan to obtain those results.   </w:t>
       </w:r>
@@ -5014,7 +5014,7 @@
           <w:color w:val="000000" w:themeColor="text1" w:themeTint="FF" w:themeShade="FF"/>
           <w:sz w:val="22"/>
           <w:szCs w:val="22"/>
-          <w:lang w:val="en"/>
+          <w:lang w:val="en-US"/>
         </w:rPr>
       </w:pPr>
       <w:r>
@@ -5030,7 +5030,7 @@
           <w:color w:val="000000" w:themeColor="text1" w:themeTint="FF" w:themeShade="FF"/>
           <w:sz w:val="22"/>
           <w:szCs w:val="22"/>
-          <w:lang w:val="en"/>
+          <w:lang w:val="en-US"/>
         </w:rPr>
         <w:t xml:space="preserve">Identify the location of at least three unique visulizations. They can additionally included here. </w:t>
       </w:r>
@@ -5089,7 +5089,7 @@
           <w:color w:val="000000" w:themeColor="text1" w:themeTint="FF" w:themeShade="FF"/>
           <w:sz w:val="22"/>
           <w:szCs w:val="22"/>
-          <w:lang w:val="en"/>
+          <w:lang w:val="en-US"/>
         </w:rPr>
       </w:pPr>
       <w:r>
@@ -5105,7 +5105,7 @@
           <w:color w:val="000000" w:themeColor="text1" w:themeTint="FF" w:themeShade="FF"/>
           <w:sz w:val="22"/>
           <w:szCs w:val="22"/>
-          <w:lang w:val="en"/>
+          <w:lang w:val="en-US"/>
         </w:rPr>
         <w:t xml:space="preserve">Include an enumerated (steps 1, 2, 3, etc.) guide to execute and use your application.  </w:t>
       </w:r>
@@ -5130,7 +5130,7 @@
           <w:color w:val="000000" w:themeColor="text1" w:themeTint="FF" w:themeShade="FF"/>
           <w:sz w:val="22"/>
           <w:szCs w:val="22"/>
-          <w:lang w:val="en"/>
+          <w:lang w:val="en-US"/>
         </w:rPr>
       </w:pPr>
       <w:r>
@@ -5146,7 +5146,7 @@
           <w:color w:val="000000" w:themeColor="text1" w:themeTint="FF" w:themeShade="FF"/>
           <w:sz w:val="22"/>
           <w:szCs w:val="22"/>
-          <w:lang w:val="en"/>
+          <w:lang w:val="en-US"/>
         </w:rPr>
         <w:t xml:space="preserve">Include instructions for downloaing and installing any necessary software or libraries. </w:t>
       </w:r>
@@ -5171,7 +5171,7 @@
           <w:color w:val="000000" w:themeColor="text1" w:themeTint="FF" w:themeShade="FF"/>
           <w:sz w:val="22"/>
           <w:szCs w:val="22"/>
-          <w:lang w:val="en"/>
+          <w:lang w:val="en-US"/>
         </w:rPr>
       </w:pPr>
       <w:r>
@@ -5187,7 +5187,7 @@
           <w:color w:val="000000" w:themeColor="text1" w:themeTint="FF" w:themeShade="FF"/>
           <w:sz w:val="22"/>
           <w:szCs w:val="22"/>
-          <w:lang w:val="en"/>
+          <w:lang w:val="en-US"/>
         </w:rPr>
         <w:t xml:space="preserve">Provide an example of how the client should use the application. </w:t>
       </w:r>
@@ -5268,7 +5268,7 @@
           <w:color w:val="000000" w:themeColor="text1" w:themeTint="FF" w:themeShade="FF"/>
           <w:sz w:val="22"/>
           <w:szCs w:val="22"/>
-          <w:lang w:val="en"/>
+          <w:lang w:val="en-US"/>
         </w:rPr>
       </w:pPr>
       <w:r>
@@ -5284,7 +5284,7 @@
           <w:color w:val="000000" w:themeColor="text1" w:themeTint="FF" w:themeShade="FF"/>
           <w:sz w:val="22"/>
           <w:szCs w:val="22"/>
-          <w:lang w:val="en"/>
+          <w:lang w:val="en-US"/>
         </w:rPr>
         <w:t xml:space="preserve">Following APA guidelines, include references for any cited works, e.g., (Author, year). References are not requried, and this page can be removed if no references are used. To cite sources used for code, you should include the referfences as code comments within the source code. </w:t>
       </w:r>
@@ -23064,7 +23064,7 @@
 </file>
 
 <file path=word/theme/theme1.xml><?xml version="1.0" encoding="utf-8"?>
-<a:theme xmlns:a="http://schemas.openxmlformats.org/drawingml/2006/main" name="Office Theme">
+<a:theme xmlns:a="http://schemas.openxmlformats.org/drawingml/2006/main" xmlns:thm15="http://schemas.microsoft.com/office/thememl/2012/main" name="Office Theme">
   <a:themeElements>
     <a:clrScheme name="Office">
       <a:dk1>
@@ -23356,4 +23356,169 @@
     </a:ext>
   </a:extLst>
 </a:theme>
+</file>
+
+<file path=customXml/item1.xml><?xml version="1.0" encoding="utf-8"?>
+<ct:contentTypeSchema xmlns:ct="http://schemas.microsoft.com/office/2006/metadata/contentType" xmlns:ma="http://schemas.microsoft.com/office/2006/metadata/properties/metaAttributes" ct:_="" ma:_="" ma:contentTypeName="Document" ma:contentTypeID="0x010100BD6C6811FDA4354DADCD440B75A43D37" ma:contentTypeVersion="3" ma:contentTypeDescription="Create a new document." ma:contentTypeScope="" ma:versionID="cca1146c5ddd7f7207d93b53ec4b7890">
+  <xsd:schema xmlns:xsd="http://www.w3.org/2001/XMLSchema" xmlns:xs="http://www.w3.org/2001/XMLSchema" xmlns:p="http://schemas.microsoft.com/office/2006/metadata/properties" xmlns:ns2="c340dd69-6dcb-4f68-be59-83f5ced86ed4" targetNamespace="http://schemas.microsoft.com/office/2006/metadata/properties" ma:root="true" ma:fieldsID="0b09d8cc436d6a436f5197c02775f266" ns2:_="">
+    <xsd:import namespace="c340dd69-6dcb-4f68-be59-83f5ced86ed4"/>
+    <xsd:element name="properties">
+      <xsd:complexType>
+        <xsd:sequence>
+          <xsd:element name="documentManagement">
+            <xsd:complexType>
+              <xsd:all>
+                <xsd:element ref="ns2:MediaServiceMetadata" minOccurs="0"/>
+                <xsd:element ref="ns2:MediaServiceFastMetadata" minOccurs="0"/>
+                <xsd:element ref="ns2:MediaServiceSearchProperties" minOccurs="0"/>
+              </xsd:all>
+            </xsd:complexType>
+          </xsd:element>
+        </xsd:sequence>
+      </xsd:complexType>
+    </xsd:element>
+  </xsd:schema>
+  <xsd:schema xmlns:xsd="http://www.w3.org/2001/XMLSchema" xmlns:xs="http://www.w3.org/2001/XMLSchema" xmlns:dms="http://schemas.microsoft.com/office/2006/documentManagement/types" xmlns:pc="http://schemas.microsoft.com/office/infopath/2007/PartnerControls" targetNamespace="c340dd69-6dcb-4f68-be59-83f5ced86ed4" elementFormDefault="qualified">
+    <xsd:import namespace="http://schemas.microsoft.com/office/2006/documentManagement/types"/>
+    <xsd:import namespace="http://schemas.microsoft.com/office/infopath/2007/PartnerControls"/>
+    <xsd:element name="MediaServiceMetadata" ma:index="8" nillable="true" ma:displayName="MediaServiceMetadata" ma:hidden="true" ma:internalName="MediaServiceMetadata" ma:readOnly="true">
+      <xsd:simpleType>
+        <xsd:restriction base="dms:Note"/>
+      </xsd:simpleType>
+    </xsd:element>
+    <xsd:element name="MediaServiceFastMetadata" ma:index="9" nillable="true" ma:displayName="MediaServiceFastMetadata" ma:hidden="true" ma:internalName="MediaServiceFastMetadata" ma:readOnly="true">
+      <xsd:simpleType>
+        <xsd:restriction base="dms:Note"/>
+      </xsd:simpleType>
+    </xsd:element>
+    <xsd:element name="MediaServiceSearchProperties" ma:index="10" nillable="true" ma:displayName="MediaServiceSearchProperties" ma:hidden="true" ma:internalName="MediaServiceSearchProperties" ma:readOnly="true">
+      <xsd:simpleType>
+        <xsd:restriction base="dms:Note"/>
+      </xsd:simpleType>
+    </xsd:element>
+  </xsd:schema>
+  <xsd:schema xmlns="http://schemas.openxmlformats.org/package/2006/metadata/core-properties" xmlns:xsd="http://www.w3.org/2001/XMLSchema" xmlns:xsi="http://www.w3.org/2001/XMLSchema-instance" xmlns:dc="http://purl.org/dc/elements/1.1/" xmlns:dcterms="http://purl.org/dc/terms/" xmlns:odoc="http://schemas.microsoft.com/internal/obd" targetNamespace="http://schemas.openxmlformats.org/package/2006/metadata/core-properties" elementFormDefault="qualified" attributeFormDefault="unqualified" blockDefault="#all">
+    <xsd:import namespace="http://purl.org/dc/elements/1.1/" schemaLocation="http://dublincore.org/schemas/xmls/qdc/2003/04/02/dc.xsd"/>
+    <xsd:import namespace="http://purl.org/dc/terms/" schemaLocation="http://dublincore.org/schemas/xmls/qdc/2003/04/02/dcterms.xsd"/>
+    <xsd:element name="coreProperties" type="CT_coreProperties"/>
+    <xsd:complexType name="CT_coreProperties">
+      <xsd:all>
+        <xsd:element ref="dc:creator" minOccurs="0" maxOccurs="1"/>
+        <xsd:element ref="dcterms:created" minOccurs="0" maxOccurs="1"/>
+        <xsd:element ref="dc:identifier" minOccurs="0" maxOccurs="1"/>
+        <xsd:element name="contentType" minOccurs="0" maxOccurs="1" type="xsd:string" ma:index="0" ma:displayName="Content Type"/>
+        <xsd:element ref="dc:title" minOccurs="0" maxOccurs="1" ma:index="4" ma:displayName="Title"/>
+        <xsd:element ref="dc:subject" minOccurs="0" maxOccurs="1"/>
+        <xsd:element ref="dc:description" minOccurs="0" maxOccurs="1"/>
+        <xsd:element name="keywords" minOccurs="0" maxOccurs="1" type="xsd:string"/>
+        <xsd:element ref="dc:language" minOccurs="0" maxOccurs="1"/>
+        <xsd:element name="category" minOccurs="0" maxOccurs="1" type="xsd:string"/>
+        <xsd:element name="version" minOccurs="0" maxOccurs="1" type="xsd:string"/>
+        <xsd:element name="revision" minOccurs="0" maxOccurs="1" type="xsd:string">
+          <xsd:annotation>
+            <xsd:documentation>
+                        This value indicates the number of saves or revisions. The application is responsible for updating this value after each revision.
+                    </xsd:documentation>
+          </xsd:annotation>
+        </xsd:element>
+        <xsd:element name="lastModifiedBy" minOccurs="0" maxOccurs="1" type="xsd:string"/>
+        <xsd:element ref="dcterms:modified" minOccurs="0" maxOccurs="1"/>
+        <xsd:element name="contentStatus" minOccurs="0" maxOccurs="1" type="xsd:string"/>
+      </xsd:all>
+    </xsd:complexType>
+  </xsd:schema>
+  <xs:schema xmlns:pc="http://schemas.microsoft.com/office/infopath/2007/PartnerControls" xmlns:xs="http://www.w3.org/2001/XMLSchema" targetNamespace="http://schemas.microsoft.com/office/infopath/2007/PartnerControls" elementFormDefault="qualified" attributeFormDefault="unqualified">
+    <xs:element name="Person">
+      <xs:complexType>
+        <xs:sequence>
+          <xs:element ref="pc:DisplayName" minOccurs="0"/>
+          <xs:element ref="pc:AccountId" minOccurs="0"/>
+          <xs:element ref="pc:AccountType" minOccurs="0"/>
+        </xs:sequence>
+      </xs:complexType>
+    </xs:element>
+    <xs:element name="DisplayName" type="xs:string"/>
+    <xs:element name="AccountId" type="xs:string"/>
+    <xs:element name="AccountType" type="xs:string"/>
+    <xs:element name="BDCAssociatedEntity">
+      <xs:complexType>
+        <xs:sequence>
+          <xs:element ref="pc:BDCEntity" minOccurs="0" maxOccurs="unbounded"/>
+        </xs:sequence>
+        <xs:attribute ref="pc:EntityNamespace"/>
+        <xs:attribute ref="pc:EntityName"/>
+        <xs:attribute ref="pc:SystemInstanceName"/>
+        <xs:attribute ref="pc:AssociationName"/>
+      </xs:complexType>
+    </xs:element>
+    <xs:attribute name="EntityNamespace" type="xs:string"/>
+    <xs:attribute name="EntityName" type="xs:string"/>
+    <xs:attribute name="SystemInstanceName" type="xs:string"/>
+    <xs:attribute name="AssociationName" type="xs:string"/>
+    <xs:element name="BDCEntity">
+      <xs:complexType>
+        <xs:sequence>
+          <xs:element ref="pc:EntityDisplayName" minOccurs="0"/>
+          <xs:element ref="pc:EntityInstanceReference" minOccurs="0"/>
+          <xs:element ref="pc:EntityId1" minOccurs="0"/>
+          <xs:element ref="pc:EntityId2" minOccurs="0"/>
+          <xs:element ref="pc:EntityId3" minOccurs="0"/>
+          <xs:element ref="pc:EntityId4" minOccurs="0"/>
+          <xs:element ref="pc:EntityId5" minOccurs="0"/>
+        </xs:sequence>
+      </xs:complexType>
+    </xs:element>
+    <xs:element name="EntityDisplayName" type="xs:string"/>
+    <xs:element name="EntityInstanceReference" type="xs:string"/>
+    <xs:element name="EntityId1" type="xs:string"/>
+    <xs:element name="EntityId2" type="xs:string"/>
+    <xs:element name="EntityId3" type="xs:string"/>
+    <xs:element name="EntityId4" type="xs:string"/>
+    <xs:element name="EntityId5" type="xs:string"/>
+    <xs:element name="Terms">
+      <xs:complexType>
+        <xs:sequence>
+          <xs:element ref="pc:TermInfo" minOccurs="0" maxOccurs="unbounded"/>
+        </xs:sequence>
+      </xs:complexType>
+    </xs:element>
+    <xs:element name="TermInfo">
+      <xs:complexType>
+        <xs:sequence>
+          <xs:element ref="pc:TermName" minOccurs="0"/>
+          <xs:element ref="pc:TermId" minOccurs="0"/>
+        </xs:sequence>
+      </xs:complexType>
+    </xs:element>
+    <xs:element name="TermName" type="xs:string"/>
+    <xs:element name="TermId" type="xs:string"/>
+  </xs:schema>
+</ct:contentTypeSchema>
+</file>
+
+<file path=customXml/item2.xml><?xml version="1.0" encoding="utf-8"?>
+<?mso-contentType ?>
+<FormTemplates xmlns="http://schemas.microsoft.com/sharepoint/v3/contenttype/forms">
+  <Display>DocumentLibraryForm</Display>
+  <Edit>DocumentLibraryForm</Edit>
+  <New>DocumentLibraryForm</New>
+</FormTemplates>
+</file>
+
+<file path=customXml/item3.xml><?xml version="1.0" encoding="utf-8"?>
+<p:properties xmlns:p="http://schemas.microsoft.com/office/2006/metadata/properties" xmlns:xsi="http://www.w3.org/2001/XMLSchema-instance" xmlns:pc="http://schemas.microsoft.com/office/infopath/2007/PartnerControls">
+  <documentManagement/>
+</p:properties>
+</file>
+
+<file path=customXml/itemProps1.xml><?xml version="1.0" encoding="utf-8"?>
+<ds:datastoreItem xmlns:ds="http://schemas.openxmlformats.org/officeDocument/2006/customXml" ds:itemID="{7F56F16F-59C0-4B9F-A29F-C9FCF73F0CE9}"/>
+</file>
+
+<file path=customXml/itemProps2.xml><?xml version="1.0" encoding="utf-8"?>
+<ds:datastoreItem xmlns:ds="http://schemas.openxmlformats.org/officeDocument/2006/customXml" ds:itemID="{4EC3A9BF-41B3-45F6-A4DC-16CB60457B16}"/>
+</file>
+
+<file path=customXml/itemProps3.xml><?xml version="1.0" encoding="utf-8"?>
+<ds:datastoreItem xmlns:ds="http://schemas.openxmlformats.org/officeDocument/2006/customXml" ds:itemID="{5938B448-A5ED-41E4-97DA-2AC634EE9645}"/>
 </file>
</xml_diff>